<commit_message>
success export chart to word
</commit_message>
<xml_diff>
--- a/storage/charts.docx
+++ b/storage/charts.docx
@@ -10,12 +10,11 @@
       </w:r>
     </w:p>
     <w:p>
-      <w:pPr/>
       <w:r>
         <w:pict>
-          <v:shape type="#_x0000_t75" stroked="f" style="width:300pt; height:235.29411764706pt; margin-left:0pt; margin-top:0pt; mso-position-horizontal:left; mso-position-vertical:top; mso-position-horizontal-relative:char; mso-position-vertical-relative:line;">
-            <w10:wrap type="inline"/>
-            <v:imagedata r:id="rId7" o:title=""/>
+          <v:shape type="#_x0000_t75" stroked="f" style="width:510pt; height:400pt; margin-left:0pt; margin-top:0pt; position:absolute; mso-position-horizontal:left; mso-position-vertical:top; mso-position-horizontal-relative:char; mso-position-vertical-relative:line;">
+            <w10:wrap type="inline" anchorx="page" anchory="page"/>
+            <v:imagedata r:id="rId1" o:title=""/>
           </v:shape>
         </w:pict>
       </w:r>

</xml_diff>

<commit_message>
button export to word
</commit_message>
<xml_diff>
--- a/storage/charts.docx
+++ b/storage/charts.docx
@@ -10,11 +10,34 @@
       </w:r>
     </w:p>
     <w:p>
+      <w:pPr/>
       <w:r>
         <w:pict>
-          <v:shape type="#_x0000_t75" stroked="f" style="width:510pt; height:400pt; margin-left:0pt; margin-top:0pt; position:absolute; mso-position-horizontal:left; mso-position-vertical:top; mso-position-horizontal-relative:char; mso-position-vertical-relative:line;">
-            <w10:wrap type="inline" anchorx="page" anchory="page"/>
-            <v:imagedata r:id="rId1" o:title=""/>
+          <v:shape type="#_x0000_t75" stroked="f" style="width:200pt; height:156.86274509804pt; margin-left:0pt; margin-top:0pt; mso-position-horizontal:left; mso-position-vertical:top; mso-position-horizontal-relative:char; mso-position-vertical-relative:line;">
+            <w10:wrap type="inline"/>
+            <v:imagedata r:id="rId7" o:title=""/>
+          </v:shape>
+        </w:pict>
+      </w:r>
+    </w:p>
+    <w:p>
+      <w:pPr/>
+      <w:r>
+        <w:pict>
+          <v:shape type="#_x0000_t75" stroked="f" style="width:200pt; height:156.86274509804pt; margin-left:0pt; margin-top:0pt; mso-position-horizontal:left; mso-position-vertical:top; mso-position-horizontal-relative:char; mso-position-vertical-relative:line;">
+            <w10:wrap type="inline"/>
+            <v:imagedata r:id="rId8" o:title=""/>
+          </v:shape>
+        </w:pict>
+      </w:r>
+    </w:p>
+    <w:p>
+      <w:pPr/>
+      <w:r>
+        <w:pict>
+          <v:shape type="#_x0000_t75" stroked="f" style="width:200pt; height:156.86274509804pt; margin-left:0pt; margin-top:0pt; mso-position-horizontal:left; mso-position-vertical:top; mso-position-horizontal-relative:char; mso-position-vertical-relative:line;">
+            <w10:wrap type="inline"/>
+            <v:imagedata r:id="rId9" o:title=""/>
           </v:shape>
         </w:pict>
       </w:r>

</xml_diff>